<commit_message>
Align narrated FireSat tours and refine responsive playback
</commit_message>
<xml_diff>
--- a/public/files/SSTPA-Methodology-White-Paper-v14.docx
+++ b/public/files/SSTPA-Methodology-White-Paper-v14.docx
@@ -1973,19 +1973,7 @@
       </w:pPr>
       <w:r>
         <w:rPr/>
-        <w:t xml:space="preserve">SSTPA as a methodology is tool agnaustic </w:t>
-      </w:r>
-      <w:r>
-        <w:rPr/>
-        <w:t xml:space="preserve">but it does rest on specific model of the “System”.  This begins with the concept of a “Capability” </w:t>
-      </w:r>
-      <w:r>
-        <w:rPr/>
-        <w:t xml:space="preserve">developed and realized by a “Project”.   Neither are themselves treated as systems.  The methodology posits systems decomposed in tiers implementing the capability.  </w:t>
-      </w:r>
-      <w:r>
-        <w:rPr/>
-        <w:t xml:space="preserve">All systems have the same rich model structure and can be decomposed through their elements to any depth.  </w:t>
+        <w:t xml:space="preserve">SSTPA as a methodology is tool agnaustic but it does rest on specific model of the “System”.  This begins with the concept of a “Capability” developed and realized by a “Project”.   Neither are themselves treated as systems.  The methodology posits systems decomposed in tiers implementing the capability.  All systems have the same rich model structure and can be decomposed through their elements to any depth.  </w:t>
       </w:r>
     </w:p>
     <w:p>
@@ -3510,7 +3498,7 @@
           <w:i w:val="false"/>
           <w:sz w:val="22"/>
         </w:rPr>
-        <w:t>A project—also called a Capability in SSTPA—is the top of the model. It holds the customer’s overall requirements and owns the Tier-1 systems that make up the architecture. From here, work is allocated downward into each system.  A Sandbox is a disposable Project owned by a specific user and can be used for out of band development and tutorials.</w:t>
+        <w:t xml:space="preserve">In the SSTPA Tools, the top of the hierarchy is the Project.  A user can create any number of projects and they all will be distinct; a property of the graph database implementation.   Projects are not systems but specify through requirements the capability needed.  Unique to the top of the hierarchy, the user must define tier-1 systems under Project and allocate requirements to them.  Below tier-1 the system model behaves recursively.  Users may also create a Sandbox which operates in the same way as a project except it is allocated to that user and intended for independent development outside the project model.  Sand-boxed systems can be used for prototyping or tutorials and can be cloned into any project the user has access to.  </w:t>
       </w:r>
     </w:p>
     <w:p>
@@ -4081,7 +4069,168 @@
           <w:i w:val="false"/>
           <w:sz w:val="22"/>
         </w:rPr>
-        <w:t>A System is the unit of analysis—the System of Interest. It brings together what the system is for, what it contains, what it does, how it connects to others, how it behaves over time, what must be protected, and which security baseline applies. Everything else in the security model hangs from this system view.</w:t>
+        <w:t>The</w:t>
+      </w:r>
+      <w:r>
+        <w:rPr>
+          <w:rFonts w:eastAsia="Calibri" w:cs="Times New Roman"/>
+          <w:b w:val="false"/>
+          <w:i w:val="false"/>
+          <w:sz w:val="22"/>
+        </w:rPr>
+        <w:t xml:space="preserve"> System is the </w:t>
+      </w:r>
+      <w:r>
+        <w:rPr>
+          <w:rFonts w:eastAsia="Calibri" w:cs="Times New Roman"/>
+          <w:b w:val="false"/>
+          <w:i w:val="false"/>
+          <w:sz w:val="22"/>
+        </w:rPr>
+        <w:t>primary</w:t>
+      </w:r>
+      <w:r>
+        <w:rPr>
+          <w:rFonts w:eastAsia="Calibri" w:cs="Times New Roman"/>
+          <w:b w:val="false"/>
+          <w:i w:val="false"/>
+          <w:sz w:val="22"/>
+        </w:rPr>
+        <w:t xml:space="preserve"> unit of analysi</w:t>
+      </w:r>
+      <w:r>
+        <w:rPr>
+          <w:rFonts w:eastAsia="Calibri" w:cs="Times New Roman"/>
+          <w:b w:val="false"/>
+          <w:i w:val="false"/>
+          <w:sz w:val="22"/>
+        </w:rPr>
+        <w:t xml:space="preserve">s in SSTPA Tools.  Systems (excepting tier-1 systems) are created by designating an element of the parent system as a system.  When doing this, the User must answer three important questions which define the purpose of the new system.  </w:t>
+      </w:r>
+      <w:r>
+        <w:rPr>
+          <w:rFonts w:eastAsia="Calibri" w:cs="Times New Roman"/>
+          <w:b w:val="false"/>
+          <w:i w:val="false"/>
+          <w:sz w:val="22"/>
+        </w:rPr>
+        <w:t>Completing the phrase</w:t>
+      </w:r>
+      <w:r>
+        <w:rPr>
+          <w:rFonts w:eastAsia="Calibri" w:cs="Times New Roman"/>
+          <w:b w:val="false"/>
+          <w:i w:val="false"/>
+          <w:sz w:val="22"/>
+        </w:rPr>
+        <w:t xml:space="preserve"> “A System to …” </w:t>
+      </w:r>
+      <w:r>
+        <w:rPr>
+          <w:rFonts w:eastAsia="Calibri" w:cs="Times New Roman"/>
+          <w:b w:val="false"/>
+          <w:i w:val="false"/>
+          <w:sz w:val="22"/>
+        </w:rPr>
+        <w:t xml:space="preserve">allows the user to </w:t>
+      </w:r>
+      <w:r>
+        <w:rPr>
+          <w:rFonts w:eastAsia="Calibri" w:cs="Times New Roman"/>
+          <w:b w:val="false"/>
+          <w:i w:val="false"/>
+          <w:sz w:val="22"/>
+        </w:rPr>
+        <w:t xml:space="preserve">concisely define the systems purpose.  </w:t>
+      </w:r>
+      <w:r>
+        <w:rPr>
+          <w:rFonts w:eastAsia="Calibri" w:cs="Times New Roman"/>
+          <w:b w:val="false"/>
+          <w:i w:val="false"/>
+          <w:sz w:val="22"/>
+        </w:rPr>
+        <w:t>Comp</w:t>
+      </w:r>
+      <w:r>
+        <w:rPr>
+          <w:rFonts w:eastAsia="Calibri" w:cs="Times New Roman"/>
+          <w:b w:val="false"/>
+          <w:i w:val="false"/>
+          <w:sz w:val="22"/>
+        </w:rPr>
+        <w:t xml:space="preserve">leting the phrase “By means of …” </w:t>
+      </w:r>
+      <w:r>
+        <w:rPr>
+          <w:rFonts w:eastAsia="Calibri" w:cs="Times New Roman"/>
+          <w:b w:val="false"/>
+          <w:i w:val="false"/>
+          <w:sz w:val="22"/>
+        </w:rPr>
+        <w:t xml:space="preserve">allows the user to begin defining </w:t>
+      </w:r>
+      <w:r>
+        <w:rPr>
+          <w:rFonts w:eastAsia="Calibri" w:cs="Times New Roman"/>
+          <w:b w:val="false"/>
+          <w:i w:val="false"/>
+          <w:sz w:val="22"/>
+        </w:rPr>
+        <w:t>system functions</w:t>
+      </w:r>
+      <w:r>
+        <w:rPr>
+          <w:rFonts w:eastAsia="Calibri" w:cs="Times New Roman"/>
+          <w:b w:val="false"/>
+          <w:i w:val="false"/>
+          <w:sz w:val="22"/>
+        </w:rPr>
+        <w:t xml:space="preserve">.  </w:t>
+      </w:r>
+      <w:r>
+        <w:rPr>
+          <w:rFonts w:eastAsia="Calibri" w:cs="Times New Roman"/>
+          <w:b w:val="false"/>
+          <w:i w:val="false"/>
+          <w:sz w:val="22"/>
+        </w:rPr>
+        <w:t xml:space="preserve">Completing the Phrase “In order to contribute to …” binds the new system to the rest of the project.  </w:t>
+      </w:r>
+      <w:r>
+        <w:rPr>
+          <w:rFonts w:eastAsia="Calibri" w:cs="Times New Roman"/>
+          <w:b w:val="false"/>
+          <w:i w:val="false"/>
+          <w:sz w:val="22"/>
+        </w:rPr>
+        <w:t xml:space="preserve"> </w:t>
+      </w:r>
+    </w:p>
+    <w:p>
+      <w:pPr>
+        <w:pStyle w:val="Normal"/>
+        <w:spacing w:lineRule="auto" w:line="276" w:before="0" w:after="120"/>
+        <w:jc w:val="left"/>
+        <w:rPr/>
+      </w:pPr>
+      <w:r>
+        <w:rPr>
+          <w:rFonts w:eastAsia="Calibri" w:cs="Times New Roman"/>
+          <w:b w:val="false"/>
+          <w:i w:val="false"/>
+          <w:sz w:val="22"/>
+        </w:rPr>
+        <w:t xml:space="preserve">Requirements allocated to the element, now become requirements for the system and it is time for the user to create functions, interfaces and new elements to inherit these requirements.  </w:t>
+      </w:r>
+      <w:r>
+        <w:rPr>
+          <w:rFonts w:eastAsia="Calibri" w:cs="Times New Roman"/>
+          <w:b w:val="false"/>
+          <w:i w:val="false"/>
+          <w:sz w:val="22"/>
+        </w:rPr>
+        <w:t xml:space="preserve">SSTPA uses a rich system model containing attributes needed for security analysis.  These are shown here.  </w:t>
       </w:r>
     </w:p>
     <w:p>
@@ -5378,7 +5527,16 @@
           <w:i w:val="false"/>
           <w:sz w:val="22"/>
         </w:rPr>
-        <w:t>Components are the parts of a system. In ordinary systems engineering they are called elements; SSTPA uses “Component” as its naming choice to avoid ambiguity with KerML’s Element concept [9]. A component can be refined into a child system of its own, which is how the hierarchy grows Tier by Tier.</w:t>
+        <w:t xml:space="preserve">Elements are tangible entities such as hardware, software, logic-ware, firmware or data.  The defining attribute of an element is its capacity to be decomposed into a child system.   is </w:t>
+      </w:r>
+      <w:r>
+        <w:rPr>
+          <w:rFonts w:eastAsia="Calibri" w:cs="Times New Roman"/>
+          <w:b w:val="false"/>
+          <w:i w:val="false"/>
+          <w:sz w:val="22"/>
+        </w:rPr>
+        <w:t>are the parts of a system. In ordinary systems engineering they are called elements; SSTPA uses “Component” as its naming choice to avoid ambiguity with KerML’s Element concept [9]. A component can be refined into a child system of its own, which is how the hierarchy grows Tier by Tier.</w:t>
       </w:r>
     </w:p>
     <w:p>

</xml_diff>